<commit_message>
docs(training-manual): reconcile the enrollment figure, drop the [TK]
The 2,000-vs-4,500 discrepancy was a moving cumulative count, not a contradiction.
Per Maven's own course listing (the primary source), Husain & Shankar's "AI Evals
for Engineers & PMs" reports 4,500+ engineers and PMs enrolled across cohorts
(OpenAI/Google/Meta/Amazon/Microsoft), as of mid-2026 — now the current figure.

Ch 1 cites it in-text with source and as-of date (the manual's own dated-figure
discipline), replacing the held-figure note. Updated the "Evidence over claims"
callback (omitted -> dated-and-sourced) and the review note. Rebuilt the .docx.

Co-Authored-By: Claude Opus 4.8 (1M context) <noreply@anthropic.com>
</commit_message>
<xml_diff>
--- a/docs/training-manual/Agon-Practitioners-Manual.docx
+++ b/docs/training-manual/Agon-Practitioners-Manual.docx
@@ -1768,29 +1768,35 @@
       </w:r>
     </w:p>
     <w:p>
-      <w:pPr>
-        <w:ind w:left="432"/>
-      </w:pPr>
+      <w:r>
+        <w:t xml:space="preserve">One concrete sign of how hungry the field is for this skill: a single practitioner course on the subject — Hamel Husain and Shreya Shankar's </w:t>
+      </w:r>
       <w:r>
         <w:rPr>
           <w:i/>
-          <w:color w:val="7B8794"/>
-        </w:rPr>
-        <w:t>A note on a number you might expect here.</w:t>
+        </w:rPr>
+        <w:t>AI Evals for Engineers &amp; PMs</w:t>
+      </w:r>
+      <w:r>
+        <w:t xml:space="preserve"> — reports more than </w:t>
+      </w:r>
+      <w:r>
+        <w:rPr>
+          <w:b/>
+        </w:rPr>
+        <w:t>4,500 engineers and product managers</w:t>
+      </w:r>
+      <w:r>
+        <w:t xml:space="preserve"> enrolled across its cohorts, drawn from teams including OpenAI, Google, Meta, Amazon, and Microsoft (per its Maven course listing, as of mid-2026). The appetite for evaluation skill is real and growing; what has lagged it is the supply of rigorous, reproducible evaluation </w:t>
       </w:r>
       <w:r>
         <w:rPr>
           <w:i/>
-          <w:color w:val="7B8794"/>
-        </w:rPr>
-        <w:t xml:space="preserve"> Industry-context discussions of this problem sometimes cite course-enrollment figures as evidence of how hungry the field is for evaluation skills. One such figure appears inconsistently across the available sources, so it is deliberately omitted rather than guessed at. This is the manual's own evidence-over-claims rule applied to itself: a number whose provenance cannot be established is flagged, not repeated. </w:t>
-      </w:r>
-      <w:r>
-        <w:rPr>
-          <w:i/>
-          <w:color w:val="7B8794"/>
-        </w:rPr>
-        <w:t>[TK: enrollment figure pending reconciliation.]</w:t>
+        </w:rPr>
+        <w:t>practice</w:t>
+      </w:r>
+      <w:r>
+        <w:t>.</w:t>
       </w:r>
     </w:p>
     <w:p>
@@ -2404,7 +2410,7 @@
         <w:t>claim</w:t>
       </w:r>
       <w:r>
-        <w:t xml:space="preserve"> it, it measures it — even when measuring is less convenient, and even in offline mode where it would be easy to fake. You saw this rule turned on the manual itself a few pages ago, with the omitted enrollment figure.</w:t>
+        <w:t xml:space="preserve"> it, it measures it — even when measuring is less convenient, and even in offline mode where it would be easy to fake. You saw the same discipline applied to the manual itself a few pages ago: the one external figure it cites — a course-enrollment count that keeps growing — is given with its source and an as-of date, not stated as a bald fact.</w:t>
       </w:r>
     </w:p>
     <w:p>

</xml_diff>